<commit_message>
chore(auto): actualizar cartas con 81 estudiantes y 63 firmas [2026-10-26 06:29]
</commit_message>
<xml_diff>
--- a/cartas_solicitud/Carta_Solicitud_ELE0300221_METODOS_NUMERICOS.docx
+++ b/cartas_solicitud/Carta_Solicitud_ELE0300221_METODOS_NUMERICOS.docx
@@ -11,7 +11,7 @@
           <w:color w:val="646464"/>
           <w:sz w:val="20"/>
         </w:rPr>
-        <w:t>Neiva, Huila, 25 de octubre de 2026</w:t>
+        <w:t>Neiva, Huila, 26 de octubre de 2026</w:t>
         <w:br/>
       </w:r>
     </w:p>
@@ -88,7 +88,7 @@
         <w:br/>
         <w:t>• Semestre del Plan de Estudios: Semestre 9°</w:t>
         <w:br/>
-        <w:t>• Total de Estudiantes Solicitantes Preinscritos: 16 estudiantes</w:t>
+        <w:t>• Total de Estudiantes Solicitantes Preinscritos: 17 estudiantes</w:t>
       </w:r>
     </w:p>
     <w:p>
@@ -97,7 +97,7 @@
         <w:jc w:val="both"/>
       </w:pPr>
       <w:r>
-        <w:t>Manifestamos nuestro compromiso formal de matrícula y cumplimiento con los requerimientos académicos y arancelarios correspondientes al curso vacacional. Dado que contamos con un grupo sólido de 16 estudiantes interesados (superando el cupo mínimo requerido de 10 estudiantes), solicitamos su valiosa gestión ante la Coordinación Académica y la Dirección de Programa para su respectiva aprobación, asignación docente y programación de horarios.</w:t>
+        <w:t>Manifestamos nuestro compromiso formal de matrícula y cumplimiento con los requerimientos académicos y arancelarios correspondientes al curso vacacional. Dado que contamos con un grupo sólido de 17 estudiantes interesados (superando el cupo mínimo requerido de 10 estudiantes), solicitamos su valiosa gestión ante la Coordinación Académica y la Dirección de Programa para su respectiva aprobación, asignación docente y programación de horarios.</w:t>
       </w:r>
     </w:p>
     <w:p>
@@ -1356,7 +1356,7 @@
                 <w:b/>
                 <w:sz w:val="17"/>
               </w:rPr>
-              <w:t>Daniel Andres Quintero Sandoval</w:t>
+              <w:t>Hector enrique quevedo tovar</w:t>
             </w:r>
           </w:p>
         </w:tc>
@@ -1379,7 +1379,7 @@
               <w:rPr>
                 <w:sz w:val="17"/>
               </w:rPr>
-              <w:t>1130657578</w:t>
+              <w:t>ELE022242026</w:t>
             </w:r>
           </w:p>
         </w:tc>
@@ -1402,7 +1402,7 @@
               <w:rPr>
                 <w:sz w:val="17"/>
               </w:rPr>
-              <w:t>3124805685</w:t>
+              <w:t>3183507777</w:t>
             </w:r>
           </w:p>
         </w:tc>
@@ -1499,7 +1499,7 @@
                 <w:b/>
                 <w:sz w:val="17"/>
               </w:rPr>
-              <w:t>JADER ANDRES CHIMUNJA JIMÉNEZ</w:t>
+              <w:t>Daniel Andres Quintero Sandoval</w:t>
             </w:r>
           </w:p>
         </w:tc>
@@ -1522,7 +1522,7 @@
               <w:rPr>
                 <w:sz w:val="17"/>
               </w:rPr>
-              <w:t>ELE120241062</w:t>
+              <w:t>1130657578</w:t>
             </w:r>
           </w:p>
         </w:tc>
@@ -1545,7 +1545,7 @@
               <w:rPr>
                 <w:sz w:val="17"/>
               </w:rPr>
-              <w:t>3183956559</w:t>
+              <w:t>3124805685</w:t>
             </w:r>
           </w:p>
         </w:tc>
@@ -1642,7 +1642,7 @@
                 <w:b/>
                 <w:sz w:val="17"/>
               </w:rPr>
-              <w:t>Juan Sebastian Jaramillo romero</w:t>
+              <w:t>JADER ANDRES CHIMUNJA JIMÉNEZ</w:t>
             </w:r>
           </w:p>
         </w:tc>
@@ -1665,7 +1665,7 @@
               <w:rPr>
                 <w:sz w:val="17"/>
               </w:rPr>
-              <w:t>1110552017</w:t>
+              <w:t>ELE120241062</w:t>
             </w:r>
           </w:p>
         </w:tc>
@@ -1688,7 +1688,7 @@
               <w:rPr>
                 <w:sz w:val="17"/>
               </w:rPr>
-              <w:t>3168512676</w:t>
+              <w:t>3183956559</w:t>
             </w:r>
           </w:p>
         </w:tc>
@@ -1710,7 +1710,7 @@
             <w:r>
               <w:drawing>
                 <wp:inline xmlns:a="http://schemas.openxmlformats.org/drawingml/2006/main" xmlns:pic="http://schemas.openxmlformats.org/drawingml/2006/picture">
-                  <wp:extent cx="1366360" cy="292608"/>
+                  <wp:extent cx="731520" cy="292608"/>
                   <wp:docPr id="8" name="Picture 8"/>
                   <wp:cNvGraphicFramePr>
                     <a:graphicFrameLocks noChangeAspect="1"/>
@@ -1731,7 +1731,7 @@
                         <pic:spPr>
                           <a:xfrm>
                             <a:off x="0" y="0"/>
-                            <a:ext cx="1366360" cy="292608"/>
+                            <a:ext cx="731520" cy="292608"/>
                           </a:xfrm>
                           <a:prstGeom prst="rect"/>
                         </pic:spPr>
@@ -1785,7 +1785,7 @@
                 <w:b/>
                 <w:sz w:val="17"/>
               </w:rPr>
-              <w:t>John jairo Sánchez garcia</w:t>
+              <w:t>Juan Sebastian Jaramillo romero</w:t>
             </w:r>
           </w:p>
         </w:tc>
@@ -1808,7 +1808,7 @@
               <w:rPr>
                 <w:sz w:val="17"/>
               </w:rPr>
-              <w:t>79843323</w:t>
+              <w:t>1110552017</w:t>
             </w:r>
           </w:p>
         </w:tc>
@@ -1831,7 +1831,7 @@
               <w:rPr>
                 <w:sz w:val="17"/>
               </w:rPr>
-              <w:t>3108505201</w:t>
+              <w:t>3168512676</w:t>
             </w:r>
           </w:p>
         </w:tc>
@@ -1853,7 +1853,7 @@
             <w:r>
               <w:drawing>
                 <wp:inline xmlns:a="http://schemas.openxmlformats.org/drawingml/2006/main" xmlns:pic="http://schemas.openxmlformats.org/drawingml/2006/picture">
-                  <wp:extent cx="1370333" cy="292608"/>
+                  <wp:extent cx="1366360" cy="292608"/>
                   <wp:docPr id="9" name="Picture 9"/>
                   <wp:cNvGraphicFramePr>
                     <a:graphicFrameLocks noChangeAspect="1"/>
@@ -1874,7 +1874,7 @@
                         <pic:spPr>
                           <a:xfrm>
                             <a:off x="0" y="0"/>
-                            <a:ext cx="1370333" cy="292608"/>
+                            <a:ext cx="1366360" cy="292608"/>
                           </a:xfrm>
                           <a:prstGeom prst="rect"/>
                         </pic:spPr>
@@ -1928,7 +1928,7 @@
                 <w:b/>
                 <w:sz w:val="17"/>
               </w:rPr>
-              <w:t>Andres Romero Peñaloza</w:t>
+              <w:t>John jairo Sánchez garcia</w:t>
             </w:r>
           </w:p>
         </w:tc>
@@ -1951,7 +1951,7 @@
               <w:rPr>
                 <w:sz w:val="17"/>
               </w:rPr>
-              <w:t>ELE120241066</w:t>
+              <w:t>79843323</w:t>
             </w:r>
           </w:p>
         </w:tc>
@@ -1974,7 +1974,7 @@
               <w:rPr>
                 <w:sz w:val="17"/>
               </w:rPr>
-              <w:t>3203612819</w:t>
+              <w:t>3108505201</w:t>
             </w:r>
           </w:p>
         </w:tc>
@@ -1996,7 +1996,7 @@
             <w:r>
               <w:drawing>
                 <wp:inline xmlns:a="http://schemas.openxmlformats.org/drawingml/2006/main" xmlns:pic="http://schemas.openxmlformats.org/drawingml/2006/picture">
-                  <wp:extent cx="809682" cy="292608"/>
+                  <wp:extent cx="1370333" cy="292608"/>
                   <wp:docPr id="10" name="Picture 10"/>
                   <wp:cNvGraphicFramePr>
                     <a:graphicFrameLocks noChangeAspect="1"/>
@@ -2017,7 +2017,7 @@
                         <pic:spPr>
                           <a:xfrm>
                             <a:off x="0" y="0"/>
-                            <a:ext cx="809682" cy="292608"/>
+                            <a:ext cx="1370333" cy="292608"/>
                           </a:xfrm>
                           <a:prstGeom prst="rect"/>
                         </pic:spPr>
@@ -2071,7 +2071,7 @@
                 <w:b/>
                 <w:sz w:val="17"/>
               </w:rPr>
-              <w:t>Yessica Andrea Triana Jaime</w:t>
+              <w:t>Andres Romero Peñaloza</w:t>
             </w:r>
           </w:p>
         </w:tc>
@@ -2094,7 +2094,7 @@
               <w:rPr>
                 <w:sz w:val="17"/>
               </w:rPr>
-              <w:t>1083903194</w:t>
+              <w:t>ELE120241066</w:t>
             </w:r>
           </w:p>
         </w:tc>
@@ -2117,7 +2117,7 @@
               <w:rPr>
                 <w:sz w:val="17"/>
               </w:rPr>
-              <w:t>3138468363</w:t>
+              <w:t>3203612819</w:t>
             </w:r>
           </w:p>
         </w:tc>
@@ -2139,7 +2139,7 @@
             <w:r>
               <w:drawing>
                 <wp:inline xmlns:a="http://schemas.openxmlformats.org/drawingml/2006/main" xmlns:pic="http://schemas.openxmlformats.org/drawingml/2006/picture">
-                  <wp:extent cx="731520" cy="292608"/>
+                  <wp:extent cx="809682" cy="292608"/>
                   <wp:docPr id="11" name="Picture 11"/>
                   <wp:cNvGraphicFramePr>
                     <a:graphicFrameLocks noChangeAspect="1"/>
@@ -2160,7 +2160,7 @@
                         <pic:spPr>
                           <a:xfrm>
                             <a:off x="0" y="0"/>
-                            <a:ext cx="731520" cy="292608"/>
+                            <a:ext cx="809682" cy="292608"/>
                           </a:xfrm>
                           <a:prstGeom prst="rect"/>
                         </pic:spPr>
@@ -2214,7 +2214,7 @@
                 <w:b/>
                 <w:sz w:val="17"/>
               </w:rPr>
-              <w:t>Yonier Castillo Mamian</w:t>
+              <w:t>Yessica Andrea Triana Jaime</w:t>
             </w:r>
           </w:p>
         </w:tc>
@@ -2237,7 +2237,7 @@
               <w:rPr>
                 <w:sz w:val="17"/>
               </w:rPr>
-              <w:t>1007393163</w:t>
+              <w:t>1083903194</w:t>
             </w:r>
           </w:p>
         </w:tc>
@@ -2260,7 +2260,7 @@
               <w:rPr>
                 <w:sz w:val="17"/>
               </w:rPr>
-              <w:t>3146332975</w:t>
+              <w:t>3138468363</w:t>
             </w:r>
           </w:p>
         </w:tc>
@@ -2357,7 +2357,7 @@
                 <w:b/>
                 <w:sz w:val="17"/>
               </w:rPr>
-              <w:t>Yamid René Potosí</w:t>
+              <w:t>Yonier Castillo Mamian</w:t>
             </w:r>
           </w:p>
         </w:tc>
@@ -2380,7 +2380,7 @@
               <w:rPr>
                 <w:sz w:val="17"/>
               </w:rPr>
-              <w:t>1063808522</w:t>
+              <w:t>1007393163</w:t>
             </w:r>
           </w:p>
         </w:tc>
@@ -2403,7 +2403,7 @@
               <w:rPr>
                 <w:sz w:val="17"/>
               </w:rPr>
-              <w:t>3042230424</w:t>
+              <w:t>3146332975</w:t>
             </w:r>
           </w:p>
         </w:tc>
@@ -2459,6 +2459,149 @@
           </w:p>
         </w:tc>
       </w:tr>
+      <w:tr>
+        <w:tc>
+          <w:tcPr>
+            <w:tcW w:type="dxa" w:w="576"/>
+            <w:tcMar>
+              <w:top w:w="100" w:type="dxa"/>
+              <w:bottom w:w="100" w:type="dxa"/>
+              <w:left w:w="80" w:type="dxa"/>
+              <w:right w:w="80" w:type="dxa"/>
+            </w:tcMar>
+            <w:shd w:fill="FFFFFF"/>
+          </w:tcPr>
+          <w:p>
+            <w:pPr>
+              <w:jc w:val="center"/>
+            </w:pPr>
+            <w:r>
+              <w:rPr>
+                <w:sz w:val="17"/>
+              </w:rPr>
+              <w:t>17</w:t>
+            </w:r>
+          </w:p>
+        </w:tc>
+        <w:tc>
+          <w:tcPr>
+            <w:tcW w:type="dxa" w:w="3312"/>
+            <w:tcMar>
+              <w:top w:w="100" w:type="dxa"/>
+              <w:bottom w:w="100" w:type="dxa"/>
+              <w:left w:w="80" w:type="dxa"/>
+              <w:right w:w="80" w:type="dxa"/>
+            </w:tcMar>
+            <w:shd w:fill="FFFFFF"/>
+          </w:tcPr>
+          <w:p>
+            <w:r>
+              <w:rPr>
+                <w:b/>
+                <w:sz w:val="17"/>
+              </w:rPr>
+              <w:t>Yamid René Potosí</w:t>
+            </w:r>
+          </w:p>
+        </w:tc>
+        <w:tc>
+          <w:tcPr>
+            <w:tcW w:type="dxa" w:w="1728"/>
+            <w:tcMar>
+              <w:top w:w="100" w:type="dxa"/>
+              <w:bottom w:w="100" w:type="dxa"/>
+              <w:left w:w="80" w:type="dxa"/>
+              <w:right w:w="80" w:type="dxa"/>
+            </w:tcMar>
+            <w:shd w:fill="FFFFFF"/>
+          </w:tcPr>
+          <w:p>
+            <w:pPr>
+              <w:jc w:val="center"/>
+            </w:pPr>
+            <w:r>
+              <w:rPr>
+                <w:sz w:val="17"/>
+              </w:rPr>
+              <w:t>1063808522</w:t>
+            </w:r>
+          </w:p>
+        </w:tc>
+        <w:tc>
+          <w:tcPr>
+            <w:tcW w:type="dxa" w:w="1584"/>
+            <w:tcMar>
+              <w:top w:w="100" w:type="dxa"/>
+              <w:bottom w:w="100" w:type="dxa"/>
+              <w:left w:w="80" w:type="dxa"/>
+              <w:right w:w="80" w:type="dxa"/>
+            </w:tcMar>
+            <w:shd w:fill="FFFFFF"/>
+          </w:tcPr>
+          <w:p>
+            <w:pPr>
+              <w:jc w:val="center"/>
+            </w:pPr>
+            <w:r>
+              <w:rPr>
+                <w:sz w:val="17"/>
+              </w:rPr>
+              <w:t>3042230424</w:t>
+            </w:r>
+          </w:p>
+        </w:tc>
+        <w:tc>
+          <w:tcPr>
+            <w:tcW w:type="dxa" w:w="2592"/>
+            <w:tcMar>
+              <w:top w:w="100" w:type="dxa"/>
+              <w:bottom w:w="100" w:type="dxa"/>
+              <w:left w:w="80" w:type="dxa"/>
+              <w:right w:w="80" w:type="dxa"/>
+            </w:tcMar>
+            <w:shd w:fill="FFFFFF"/>
+          </w:tcPr>
+          <w:p>
+            <w:pPr>
+              <w:jc w:val="center"/>
+            </w:pPr>
+            <w:r>
+              <w:drawing>
+                <wp:inline xmlns:a="http://schemas.openxmlformats.org/drawingml/2006/main" xmlns:pic="http://schemas.openxmlformats.org/drawingml/2006/picture">
+                  <wp:extent cx="731520" cy="292608"/>
+                  <wp:docPr id="14" name="Picture 14"/>
+                  <wp:cNvGraphicFramePr>
+                    <a:graphicFrameLocks noChangeAspect="1"/>
+                  </wp:cNvGraphicFramePr>
+                  <a:graphic>
+                    <a:graphicData uri="http://schemas.openxmlformats.org/drawingml/2006/picture">
+                      <pic:pic>
+                        <pic:nvPicPr>
+                          <pic:cNvPr id="0" name="image.png"/>
+                          <pic:cNvPicPr/>
+                        </pic:nvPicPr>
+                        <pic:blipFill>
+                          <a:blip r:embed="rId22"/>
+                          <a:stretch>
+                            <a:fillRect/>
+                          </a:stretch>
+                        </pic:blipFill>
+                        <pic:spPr>
+                          <a:xfrm>
+                            <a:off x="0" y="0"/>
+                            <a:ext cx="731520" cy="292608"/>
+                          </a:xfrm>
+                          <a:prstGeom prst="rect"/>
+                        </pic:spPr>
+                      </pic:pic>
+                    </a:graphicData>
+                  </a:graphic>
+                </wp:inline>
+              </w:drawing>
+            </w:r>
+          </w:p>
+        </w:tc>
+      </w:tr>
     </w:tbl>
     <w:p>
       <w:pPr>
@@ -2484,7 +2627,7 @@
           <w:color w:val="8C8C8C"/>
           <w:sz w:val="17"/>
         </w:rPr>
-        <w:t>(Respaldo de Representación Estudiantil al alcanzar 15 firmas • Actual: 13/15 firmas)</w:t>
+        <w:t>(Respaldo de Representación Estudiantil al alcanzar 15 firmas • Actual: 14/15 firmas)</w:t>
       </w:r>
     </w:p>
     <w:sectPr>

</xml_diff>